<commit_message>
Add final report, presentation, and Q4 slope-deflection sample
- Add deliverables: Final Project.docx, Structural_Analysis_Presentation.pptx,
  and Theoretical_Background.docx; refresh USER_MANUAL.docx
- Add SampleModels.Q4Frame() (two-storey slope-deflection demo frame) and
  load it as the startup default model

Co-Authored-By: Claude Opus 4.8 <noreply@anthropic.com>
</commit_message>
<xml_diff>
--- a/USER_MANUAL.docx
+++ b/USER_MANUAL.docx
@@ -1530,423 +1530,6 @@
         </w:tc>
       </w:tr>
     </w:tbl>
-    <w:p/>
-    <w:p/>
-    <w:p/>
-    <w:p>
-      <w:r>
-        <w:t>1. Brief Introduction to the Program</w:t>
-      </w:r>
-    </w:p>
-    <w:p>
-      <w:r>
-        <w:t xml:space="preserve">A from-scratch 2D structural analysis and timber-design desktop application (C# / .NET 10 / WPF). It analyzes plane frames and trusses by the linear-elastic direct stiffness (matrix displacement) method, then runs timber member design to three codes (US/NDS, Eurocode 5, Turkish TBDY). Capabilities: nodal + member loads (UDL, point, thermal), support settlements, moment releases/hinges, reactions, nodal displacements, N/V/M diagrams and deflected shapes, code-based load combinations, and D/C utilization ratios per member. Everything — solver, loading engine, design engine, matrix library — is hand-built; no analysis library is used (only </w:t>
-      </w:r>
-      <w:proofErr w:type="spellStart"/>
-      <w:r>
-        <w:t>CSparse</w:t>
-      </w:r>
-      <w:proofErr w:type="spellEnd"/>
-      <w:r>
-        <w:t xml:space="preserve"> for the sparse Cholesky solve).</w:t>
-      </w:r>
-    </w:p>
-    <w:p>
-      <w:r>
-        <w:t>2. Program Structure and Data Organization (the OOP story — emphasize this)</w:t>
-      </w:r>
-    </w:p>
-    <w:p>
-      <w:r>
-        <w:t>Show the layered, one-directional architecture: </w:t>
-      </w:r>
-      <w:proofErr w:type="spellStart"/>
-      <w:r>
-        <w:t>FrameAnalysis.UI</w:t>
-      </w:r>
-      <w:proofErr w:type="spellEnd"/>
-      <w:r>
-        <w:t> (WPF) → </w:t>
-      </w:r>
-      <w:proofErr w:type="spellStart"/>
-      <w:proofErr w:type="gramStart"/>
-      <w:r>
-        <w:t>FrameAnalysis.UI.Core</w:t>
-      </w:r>
-      <w:proofErr w:type="spellEnd"/>
-      <w:proofErr w:type="gramEnd"/>
-      <w:r>
-        <w:t> (WPF-free VMs/services) → </w:t>
-      </w:r>
-      <w:proofErr w:type="spellStart"/>
-      <w:r>
-        <w:t>FrameAnalysisProgram</w:t>
-      </w:r>
-      <w:proofErr w:type="spellEnd"/>
-      <w:r>
-        <w:t> (solver) + </w:t>
-      </w:r>
-      <w:proofErr w:type="spellStart"/>
-      <w:r>
-        <w:t>MemberDesigner</w:t>
-      </w:r>
-      <w:proofErr w:type="spellEnd"/>
-      <w:r>
-        <w:t> (design) + </w:t>
-      </w:r>
-      <w:proofErr w:type="spellStart"/>
-      <w:r>
-        <w:t>StructuralLoads</w:t>
-      </w:r>
-      <w:proofErr w:type="spellEnd"/>
-      <w:r>
-        <w:t> + </w:t>
-      </w:r>
-      <w:proofErr w:type="spellStart"/>
-      <w:r>
-        <w:t>Matrix_Library</w:t>
-      </w:r>
-      <w:proofErr w:type="spellEnd"/>
-      <w:r>
-        <w:t>. Key OOP points to call out:</w:t>
-      </w:r>
-    </w:p>
-    <w:p>
-      <w:pPr>
-        <w:numPr>
-          <w:ilvl w:val="0"/>
-          <w:numId w:val="10"/>
-        </w:numPr>
-      </w:pPr>
-      <w:r>
-        <w:t>Polymorphic elements: abstract StructuralElement2D with FrameElement2D (6 DOF) and TrussElement2D (4 DOF) overriding stiffness/rotation — the assembler treats them uniformly via </w:t>
-      </w:r>
-      <w:proofErr w:type="spellStart"/>
-      <w:proofErr w:type="gramStart"/>
-      <w:r>
-        <w:t>GetDofAddresses</w:t>
-      </w:r>
-      <w:proofErr w:type="spellEnd"/>
-      <w:r>
-        <w:t>(</w:t>
-      </w:r>
-      <w:proofErr w:type="gramEnd"/>
-      <w:r>
-        <w:t>).</w:t>
-      </w:r>
-    </w:p>
-    <w:p>
-      <w:pPr>
-        <w:numPr>
-          <w:ilvl w:val="0"/>
-          <w:numId w:val="10"/>
-        </w:numPr>
-      </w:pPr>
-      <w:r>
-        <w:t>Interface-driven loads: INodalLoad / IMemberLoad (UniformDistributedLoad, PointLoad, TemperatureLoad) each know how to </w:t>
-      </w:r>
-      <w:proofErr w:type="spellStart"/>
-      <w:proofErr w:type="gramStart"/>
-      <w:r>
-        <w:t>AssembleIntoVector</w:t>
-      </w:r>
-      <w:proofErr w:type="spellEnd"/>
-      <w:r>
-        <w:t>(</w:t>
-      </w:r>
-      <w:proofErr w:type="gramEnd"/>
-      <w:r>
-        <w:t>) — adding a load type doesn't touch the solver.</w:t>
-      </w:r>
-    </w:p>
-    <w:p>
-      <w:pPr>
-        <w:numPr>
-          <w:ilvl w:val="0"/>
-          <w:numId w:val="10"/>
-        </w:numPr>
-      </w:pPr>
-      <w:r>
-        <w:t>Strategy pattern for solvers: </w:t>
-      </w:r>
-      <w:proofErr w:type="spellStart"/>
-      <w:r>
-        <w:t>SparseLDLtSolver</w:t>
-      </w:r>
-      <w:proofErr w:type="spellEnd"/>
-      <w:r>
-        <w:t> vs </w:t>
-      </w:r>
-      <w:proofErr w:type="spellStart"/>
-      <w:r>
-        <w:t>CSparseCholeskySolver</w:t>
-      </w:r>
-      <w:proofErr w:type="spellEnd"/>
-      <w:r>
-        <w:t> are swappable.</w:t>
-      </w:r>
-    </w:p>
-    <w:p>
-      <w:pPr>
-        <w:numPr>
-          <w:ilvl w:val="0"/>
-          <w:numId w:val="10"/>
-        </w:numPr>
-      </w:pPr>
-      <w:r>
-        <w:t>Generic design-check interface </w:t>
-      </w:r>
-      <w:proofErr w:type="spellStart"/>
-      <w:r>
-        <w:t>ITimberDesignCheck</w:t>
-      </w:r>
-      <w:proofErr w:type="spellEnd"/>
-      <w:r>
-        <w:t>&lt;</w:t>
-      </w:r>
-      <w:proofErr w:type="spellStart"/>
-      <w:proofErr w:type="gramStart"/>
-      <w:r>
-        <w:t>TInput,TData</w:t>
-      </w:r>
-      <w:proofErr w:type="spellEnd"/>
-      <w:proofErr w:type="gramEnd"/>
-      <w:r>
-        <w:t>&gt; with a dependency graph (Parameters → other checks), run via topological levels in </w:t>
-      </w:r>
-      <w:proofErr w:type="spellStart"/>
-      <w:r>
-        <w:t>ATimberDesigner.CheckDesignAsync</w:t>
-      </w:r>
-      <w:proofErr w:type="spellEnd"/>
-      <w:r>
-        <w:t>.</w:t>
-      </w:r>
-    </w:p>
-    <w:p>
-      <w:pPr>
-        <w:numPr>
-          <w:ilvl w:val="0"/>
-          <w:numId w:val="10"/>
-        </w:numPr>
-      </w:pPr>
-      <w:r>
-        <w:lastRenderedPageBreak/>
-        <w:t>Data flow / DTO boundary: tabular </w:t>
-      </w:r>
-      <w:proofErr w:type="spellStart"/>
-      <w:r>
-        <w:t>StructureInputData</w:t>
-      </w:r>
-      <w:proofErr w:type="spellEnd"/>
-      <w:r>
-        <w:t> → </w:t>
-      </w:r>
-      <w:proofErr w:type="spellStart"/>
-      <w:r>
-        <w:t>StructureModelBuilder</w:t>
-      </w:r>
-      <w:proofErr w:type="spellEnd"/>
-      <w:r>
-        <w:t> → object StructureModel → FrameAnalyzer.Analyze → FrameAnalysisResult. The UI's </w:t>
-      </w:r>
-      <w:proofErr w:type="spellStart"/>
-      <w:r>
-        <w:t>ProjectDocument</w:t>
-      </w:r>
-      <w:proofErr w:type="spellEnd"/>
-      <w:r>
-        <w:t> (observable VMs, object references) is the single source of truth and is mapped to the DTO only at export.</w:t>
-      </w:r>
-    </w:p>
-    <w:p>
-      <w:r>
-        <w:t>3. User Interface and Input Procedure</w:t>
-      </w:r>
-    </w:p>
-    <w:p>
-      <w:r>
-        <w:t>Demo the shell: split window — editable grids on the left (menu-driven sheets), live 2D canvas on the right. Walk through input order: Nodes (X,Y) → Materials (pick a timber grade, design values auto-fill from EN 338/NDS database) → Sections (</w:t>
-      </w:r>
-      <w:proofErr w:type="spellStart"/>
-      <w:r>
-        <w:t>b×d</w:t>
-      </w:r>
-      <w:proofErr w:type="spellEnd"/>
-      <w:r>
-        <w:t>, I) → Elements (combo-box references to nodes/material/section, Frame/Truss, moment release) → Supports → Loads (joint / distributed / point / thermal / settlement). Stress that the picture updates live on every edit and references are by object (reorder/delete is safe). Then Design → Project Details to choose code + service class/moisture + load duration. (No external CAD/Excel import — say so explicitly; the rubric only asks </w:t>
-      </w:r>
-      <w:r>
-        <w:rPr>
-          <w:i/>
-          <w:iCs/>
-        </w:rPr>
-        <w:t>if</w:t>
-      </w:r>
-      <w:r>
-        <w:t> you use one.)</w:t>
-      </w:r>
-    </w:p>
-    <w:p>
-      <w:r>
-        <w:t>4. Analysis Demonstration (must be user-defined, not the seeded sample)</w:t>
-      </w:r>
-    </w:p>
-    <w:p>
-      <w:r>
-        <w:t xml:space="preserve">Critical: the rubric </w:t>
-      </w:r>
-      <w:proofErr w:type="gramStart"/>
-      <w:r>
-        <w:t>says</w:t>
-      </w:r>
-      <w:proofErr w:type="gramEnd"/>
-      <w:r>
-        <w:t> </w:t>
-      </w:r>
-      <w:r>
-        <w:rPr>
-          <w:i/>
-          <w:iCs/>
-        </w:rPr>
-        <w:t>"should not be a hardcoded model."</w:t>
-      </w:r>
-      <w:r>
-        <w:t xml:space="preserve"> Your app boots the sample portal frame — do not analyze that one on camera. Either type a fresh model live (e.g., a </w:t>
-      </w:r>
-      <w:proofErr w:type="gramStart"/>
-      <w:r>
-        <w:t>simply-supported</w:t>
-      </w:r>
-      <w:proofErr w:type="gramEnd"/>
-      <w:r>
-        <w:t xml:space="preserve"> beam or a different frame) or clear and re-enter the grids, then hit Run Analysis (async, off the UI thread). Show the workflow from empty grids → geometry on canvas → loads → solve. Mention the solver never crashes: an unstable model surfaces a clear message (singularity detector pinpoints the node/DOF) instead of throwing.</w:t>
-      </w:r>
-    </w:p>
-    <w:p>
-      <w:r>
-        <w:t>5. Post-Processing and Visualization</w:t>
-      </w:r>
-    </w:p>
-    <w:p>
-      <w:r>
-        <w:t>Show: deflected shape overlay on the canvas (Hermite-cubic curve, adjustable amplification slider), support reactions (arrows + table), and the per-member result popup (double-click a member) with stacked N, V, M diagrams + deflected shape, where extrema are sampled exactly (shear-</w:t>
-      </w:r>
-      <w:proofErr w:type="gramStart"/>
-      <w:r>
-        <w:t>zero point</w:t>
-      </w:r>
-      <w:proofErr w:type="gramEnd"/>
-      <w:r>
-        <w:t>, point-load steps). Then Run Design → Design Results sheet with per-member D/C ratios color-coded Pass/Warning/Fail and the governing check + load combination.</w:t>
-      </w:r>
-    </w:p>
-    <w:p>
-      <w:r>
-        <w:t>6. Verification (have this ready as a distinct section)</w:t>
-      </w:r>
-    </w:p>
-    <w:p>
-      <w:r>
-        <w:t>Your strongest material is </w:t>
-      </w:r>
-      <w:proofErr w:type="spellStart"/>
-      <w:r>
-        <w:t>FEMTestProject</w:t>
-      </w:r>
-      <w:proofErr w:type="spellEnd"/>
-      <w:r>
-        <w:t> (88 passing tests). Use the closed-form checks in </w:t>
-      </w:r>
-      <w:proofErr w:type="spellStart"/>
-      <w:r>
-        <w:t>SectionForceRecoveryTests</w:t>
-      </w:r>
-      <w:proofErr w:type="spellEnd"/>
-      <w:r>
-        <w:t xml:space="preserve"> — cantilever, simply-supported UDL, point load — as textbook verification of M/V and deflection. Reinforce with the post-solve equilibrium residual check (‖K·U − F‖) the analyzer runs internally. For credibility, also do one hand-calc on camera (e.g., SS beam under UDL: reaction = </w:t>
-      </w:r>
-      <w:proofErr w:type="spellStart"/>
-      <w:r>
-        <w:t>wL</w:t>
-      </w:r>
-      <w:proofErr w:type="spellEnd"/>
-      <w:r>
-        <w:t xml:space="preserve">/2, </w:t>
-      </w:r>
-      <w:proofErr w:type="spellStart"/>
-      <w:r>
-        <w:t>M_max</w:t>
-      </w:r>
-      <w:proofErr w:type="spellEnd"/>
-      <w:r>
-        <w:t xml:space="preserve"> = wL²/8, δ = 5wL⁴/384EI) and match it to the program's output. State the reference explicitly ("Hibbeler / closed-form beam solutions").</w:t>
-      </w:r>
-    </w:p>
-    <w:p>
-      <w:r>
-        <w:t>7. Limitations and Possible Improvements</w:t>
-      </w:r>
-    </w:p>
-    <w:p>
-      <w:r>
-        <w:t xml:space="preserve">Limitations: 2D only (no minor-axis/out-of-plane, no 3D); linear-elastic, small-displacement (no P-Δ, no buckling-length auto-calc, no modal/dynamic); timber-only design (US solid-members only; some TR </w:t>
-      </w:r>
-      <w:r>
-        <w:lastRenderedPageBreak/>
-        <w:t>checks simplified, e.g. C</w:t>
-      </w:r>
-      <w:r>
-        <w:rPr>
-          <w:rFonts w:ascii="Cambria Math" w:hAnsi="Cambria Math" w:cs="Cambria Math"/>
-        </w:rPr>
-        <w:t>⊥</w:t>
-      </w:r>
-      <w:r>
-        <w:t>; no detailed printable report yet);</w:t>
-      </w:r>
-      <w:r>
-        <w:rPr>
-          <w:rFonts w:cs="Calibri"/>
-        </w:rPr>
-        <w:t> </w:t>
-      </w:r>
-      <w:r>
-        <w:t>no save/load yet. Improvements:</w:t>
-      </w:r>
-      <w:r>
-        <w:rPr>
-          <w:rFonts w:cs="Calibri"/>
-        </w:rPr>
-        <w:t> </w:t>
-      </w:r>
-      <w:r>
-        <w:t>project persistence (JSON),</w:t>
-      </w:r>
-      <w:r>
-        <w:rPr>
-          <w:rFonts w:cs="Calibri"/>
-        </w:rPr>
-        <w:t> </w:t>
-      </w:r>
-      <w:r>
-        <w:t>calc-report export, steel/concrete modules (architecture already supports it), 3D via the swappable</w:t>
-      </w:r>
-      <w:r>
-        <w:rPr>
-          <w:rFonts w:cs="Calibri"/>
-        </w:rPr>
-        <w:t> </w:t>
-      </w:r>
-      <w:proofErr w:type="spellStart"/>
-      <w:r>
-        <w:t>IStructuralRenderer</w:t>
-      </w:r>
-      <w:proofErr w:type="spellEnd"/>
-      <w:r>
-        <w:t>, full design-envelope across all combinations, and CAD/BIM import.</w:t>
-      </w:r>
-    </w:p>
     <w:p/>
     <w:sectPr>
       <w:pgSz w:w="12240" w:h="15840"/>
@@ -2919,6 +2502,7 @@
   <w:style w:type="character" w:default="1" w:styleId="DefaultParagraphFont">
     <w:name w:val="Default Paragraph Font"/>
     <w:uiPriority w:val="1"/>
+    <w:semiHidden/>
     <w:unhideWhenUsed/>
   </w:style>
   <w:style w:type="table" w:default="1" w:styleId="TableNormal">

</xml_diff>